<commit_message>
Phan tich du lieu
</commit_message>
<xml_diff>
--- a/HCM_KS25_PhamQuocAnh_de01.docx
+++ b/HCM_KS25_PhamQuocAnh_de01.docx
@@ -3,6 +3,558 @@
 <w:document xmlns:wpc="http://schemas.microsoft.com/office/word/2010/wordprocessingCanvas" xmlns:cx="http://schemas.microsoft.com/office/drawing/2014/chartex" xmlns:cx1="http://schemas.microsoft.com/office/drawing/2015/9/8/chartex" xmlns:cx2="http://schemas.microsoft.com/office/drawing/2015/10/21/chartex" xmlns:cx3="http://schemas.microsoft.com/office/drawing/2016/5/9/chartex" xmlns:cx4="http://schemas.microsoft.com/office/drawing/2016/5/10/chartex" xmlns:cx5="http://schemas.microsoft.com/office/drawing/2016/5/11/chartex" xmlns:cx6="http://schemas.microsoft.com/office/drawing/2016/5/12/chartex" xmlns:cx7="http://schemas.microsoft.com/office/drawing/2016/5/13/chartex" xmlns:cx8="http://schemas.microsoft.com/office/drawing/2016/5/14/chartex" xmlns:mc="http://schemas.openxmlformats.org/markup-compatibility/2006" xmlns:o="urn:schemas-microsoft-com:office:office" xmlns:r="http://schemas.openxmlformats.org/officeDocument/2006/relationships" xmlns:m="http://schemas.openxmlformats.org/officeDocument/2006/math" xmlns:v="urn:schemas-microsoft-com:vml" xmlns:wp14="http://schemas.microsoft.com/office/word/2010/wordprocessingDrawing" xmlns:wp="http://schemas.openxmlformats.org/drawingml/2006/wordprocessingDrawing" xmlns:w="http://schemas.openxmlformats.org/wordprocessingml/2006/main" xmlns:w14="http://schemas.microsoft.com/office/word/2010/wordml" xmlns:w10="urn:schemas-microsoft-com:office:word" xmlns:w15="http://schemas.microsoft.com/office/word/2012/wordml" xmlns:wpg="http://schemas.microsoft.com/office/word/2010/wordprocessingGroup" xmlns:wpi="http://schemas.microsoft.com/office/word/2010/wordprocessingInk" xmlns:wne="http://schemas.microsoft.com/office/word/2006/wordml" xmlns:wps="http://schemas.microsoft.com/office/word/2010/wordprocessingShape" xmlns:wpsCustomData="http://www.wps.cn/officeDocument/2013/wpsCustomData" mc:Ignorable="w14 w15 wp14">
   <w:body>
     <w:p>
+      <w:pPr>
+        <w:rPr>
+          <w:rFonts w:hint="default"/>
+          <w:lang w:val="en-US"/>
+        </w:rPr>
+      </w:pPr>
+      <w:r>
+        <w:rPr>
+          <w:rFonts w:hint="default"/>
+          <w:lang w:val="en-US"/>
+        </w:rPr>
+        <w:t>Lớp: HCM_KS25_CNTT5</w:t>
+      </w:r>
+    </w:p>
+    <w:p>
+      <w:pPr>
+        <w:rPr>
+          <w:rFonts w:hint="default"/>
+          <w:lang w:val="en-US"/>
+        </w:rPr>
+      </w:pPr>
+      <w:r>
+        <w:rPr>
+          <w:rFonts w:hint="default"/>
+          <w:lang w:val="en-US"/>
+        </w:rPr>
+        <w:t>Sinh viên: Phạm Quốc Anh</w:t>
+      </w:r>
+    </w:p>
+    <w:p>
+      <w:pPr>
+        <w:rPr>
+          <w:rFonts w:hint="default"/>
+          <w:lang w:val="en-US"/>
+        </w:rPr>
+      </w:pPr>
+      <w:r>
+        <w:rPr>
+          <w:rFonts w:hint="default"/>
+          <w:lang w:val="en-US"/>
+        </w:rPr>
+        <w:t>Môn IT105-Phân tích thiết kế hệ thống</w:t>
+      </w:r>
+    </w:p>
+    <w:p>
+      <w:pPr>
+        <w:rPr>
+          <w:rFonts w:hint="default"/>
+          <w:lang w:val="en-US"/>
+        </w:rPr>
+      </w:pPr>
+    </w:p>
+    <w:p>
+      <w:pPr>
+        <w:rPr>
+          <w:rFonts w:hint="default"/>
+          <w:lang w:val="en-US"/>
+        </w:rPr>
+      </w:pPr>
+      <w:r>
+        <w:rPr>
+          <w:rFonts w:hint="default"/>
+          <w:lang w:val="en-US"/>
+        </w:rPr>
+        <w:t>Câu 1:</w:t>
+      </w:r>
+    </w:p>
+    <w:p>
+      <w:pPr>
+        <w:rPr>
+          <w:rFonts w:hint="default"/>
+          <w:lang w:val="en-US"/>
+        </w:rPr>
+      </w:pPr>
+    </w:p>
+    <w:tbl>
+      <w:tblPr>
+        <w:tblStyle w:val="4"/>
+        <w:tblW w:w="9637" w:type="dxa"/>
+        <w:tblInd w:w="0" w:type="dxa"/>
+        <w:tblBorders>
+          <w:top w:val="single" w:color="auto" w:sz="4" w:space="0"/>
+          <w:left w:val="single" w:color="auto" w:sz="4" w:space="0"/>
+          <w:bottom w:val="single" w:color="auto" w:sz="4" w:space="0"/>
+          <w:right w:val="single" w:color="auto" w:sz="4" w:space="0"/>
+          <w:insideH w:val="single" w:color="auto" w:sz="4" w:space="0"/>
+          <w:insideV w:val="single" w:color="auto" w:sz="4" w:space="0"/>
+        </w:tblBorders>
+        <w:tblLayout w:type="autofit"/>
+        <w:tblCellMar>
+          <w:left w:w="108" w:type="dxa"/>
+          <w:right w:w="108" w:type="dxa"/>
+        </w:tblCellMar>
+      </w:tblPr>
+      <w:tblGrid>
+        <w:gridCol w:w="2452"/>
+        <w:gridCol w:w="7185"/>
+      </w:tblGrid>
+      <w:tr>
+        <w:trPr>
+          <w:trHeight w:val="202" w:hRule="atLeast"/>
+        </w:trPr>
+        <w:tc>
+          <w:tcPr>
+            <w:tcW w:w="2452" w:type="dxa"/>
+            <w:shd w:val="clear" w:color="auto" w:fill="4874CB" w:themeFill="accent1"/>
+          </w:tcPr>
+          <w:p>
+            <w:pPr>
+              <w:jc w:val="center"/>
+              <w:rPr>
+                <w:rFonts w:hint="default"/>
+                <w:vertAlign w:val="baseline"/>
+                <w:lang w:val="en-US"/>
+              </w:rPr>
+            </w:pPr>
+            <w:r>
+              <w:rPr>
+                <w:rFonts w:hint="default"/>
+                <w:color w:val="E7E6E6" w:themeColor="background2"/>
+                <w:vertAlign w:val="baseline"/>
+                <w:lang w:val="en-US"/>
+                <w14:textFill>
+                  <w14:solidFill>
+                    <w14:schemeClr w14:val="bg2"/>
+                  </w14:solidFill>
+                </w14:textFill>
+              </w:rPr>
+              <w:t>Mục</w:t>
+            </w:r>
+          </w:p>
+        </w:tc>
+        <w:tc>
+          <w:tcPr>
+            <w:tcW w:w="7185" w:type="dxa"/>
+            <w:shd w:val="clear" w:color="auto" w:fill="4874CB" w:themeFill="accent1"/>
+          </w:tcPr>
+          <w:p>
+            <w:pPr>
+              <w:jc w:val="center"/>
+              <w:rPr>
+                <w:rFonts w:hint="default"/>
+                <w:vertAlign w:val="baseline"/>
+                <w:lang w:val="en-US"/>
+              </w:rPr>
+            </w:pPr>
+            <w:r>
+              <w:rPr>
+                <w:rFonts w:hint="default"/>
+                <w:color w:val="E7E6E6" w:themeColor="background2"/>
+                <w:vertAlign w:val="baseline"/>
+                <w:lang w:val="en-US"/>
+                <w14:textFill>
+                  <w14:solidFill>
+                    <w14:schemeClr w14:val="bg2"/>
+                  </w14:solidFill>
+                </w14:textFill>
+              </w:rPr>
+              <w:t>Nội dung</w:t>
+            </w:r>
+          </w:p>
+        </w:tc>
+      </w:tr>
+      <w:tr>
+        <w:trPr>
+          <w:trHeight w:val="216" w:hRule="atLeast"/>
+        </w:trPr>
+        <w:tc>
+          <w:tcPr>
+            <w:tcW w:w="2452" w:type="dxa"/>
+          </w:tcPr>
+          <w:p>
+            <w:pPr>
+              <w:jc w:val="center"/>
+              <w:rPr>
+                <w:rFonts w:hint="default"/>
+                <w:vertAlign w:val="baseline"/>
+                <w:lang w:val="en-US"/>
+              </w:rPr>
+            </w:pPr>
+            <w:r>
+              <w:rPr>
+                <w:rFonts w:hint="default"/>
+                <w:vertAlign w:val="baseline"/>
+                <w:lang w:val="en-US"/>
+              </w:rPr>
+              <w:t>Actor chính - Vai trò</w:t>
+            </w:r>
+          </w:p>
+        </w:tc>
+        <w:tc>
+          <w:tcPr>
+            <w:tcW w:w="7185" w:type="dxa"/>
+          </w:tcPr>
+          <w:p>
+            <w:pPr>
+              <w:rPr>
+                <w:rFonts w:hint="default"/>
+                <w:vertAlign w:val="baseline"/>
+                <w:lang w:val="en-US"/>
+              </w:rPr>
+            </w:pPr>
+            <w:r>
+              <w:rPr>
+                <w:rFonts w:hint="default"/>
+                <w:vertAlign w:val="baseline"/>
+                <w:lang w:val="en-US"/>
+              </w:rPr>
+              <w:t>- Bệnh nhân thực hiện chọn ngày khám, chọn khoa khám, bác sĩ, chọn khung giờ, xem chi tiết chi phí khám chữa bệnh, thông tin lịch khám và xác nhận đặt lịch</w:t>
+            </w:r>
+          </w:p>
+        </w:tc>
+      </w:tr>
+      <w:tr>
+        <w:tc>
+          <w:tcPr>
+            <w:tcW w:w="2452" w:type="dxa"/>
+          </w:tcPr>
+          <w:p>
+            <w:pPr>
+              <w:jc w:val="center"/>
+              <w:rPr>
+                <w:rFonts w:hint="default"/>
+                <w:vertAlign w:val="baseline"/>
+                <w:lang w:val="en-US"/>
+              </w:rPr>
+            </w:pPr>
+            <w:r>
+              <w:rPr>
+                <w:rFonts w:hint="default"/>
+                <w:vertAlign w:val="baseline"/>
+                <w:lang w:val="en-US"/>
+              </w:rPr>
+              <w:t>Yêu cầu chức năng</w:t>
+            </w:r>
+          </w:p>
+        </w:tc>
+        <w:tc>
+          <w:tcPr>
+            <w:tcW w:w="7185" w:type="dxa"/>
+          </w:tcPr>
+          <w:p>
+            <w:pPr>
+              <w:numPr>
+                <w:ilvl w:val="0"/>
+                <w:numId w:val="1"/>
+              </w:numPr>
+              <w:rPr>
+                <w:rFonts w:hint="default"/>
+                <w:vertAlign w:val="baseline"/>
+                <w:lang w:val="en-US"/>
+              </w:rPr>
+            </w:pPr>
+            <w:r>
+              <w:rPr>
+                <w:rFonts w:hint="default"/>
+                <w:vertAlign w:val="baseline"/>
+                <w:lang w:val="en-US"/>
+              </w:rPr>
+              <w:t>Chọn chuyên khoa và ngày khám</w:t>
+            </w:r>
+          </w:p>
+          <w:p>
+            <w:pPr>
+              <w:numPr>
+                <w:ilvl w:val="0"/>
+                <w:numId w:val="1"/>
+              </w:numPr>
+              <w:ind w:left="0" w:leftChars="0" w:firstLine="0" w:firstLineChars="0"/>
+              <w:rPr>
+                <w:rFonts w:hint="default"/>
+                <w:vertAlign w:val="baseline"/>
+                <w:lang w:val="en-US"/>
+              </w:rPr>
+            </w:pPr>
+            <w:r>
+              <w:rPr>
+                <w:rFonts w:hint="default"/>
+                <w:vertAlign w:val="baseline"/>
+                <w:lang w:val="en-US"/>
+              </w:rPr>
+              <w:t xml:space="preserve">Chọn bác sĩ </w:t>
+            </w:r>
+          </w:p>
+          <w:p>
+            <w:pPr>
+              <w:numPr>
+                <w:ilvl w:val="0"/>
+                <w:numId w:val="1"/>
+              </w:numPr>
+              <w:ind w:left="0" w:leftChars="0" w:firstLine="0" w:firstLineChars="0"/>
+              <w:rPr>
+                <w:rFonts w:hint="default"/>
+                <w:vertAlign w:val="baseline"/>
+                <w:lang w:val="en-US"/>
+              </w:rPr>
+            </w:pPr>
+            <w:r>
+              <w:rPr>
+                <w:rFonts w:hint="default"/>
+                <w:vertAlign w:val="baseline"/>
+                <w:lang w:val="en-US"/>
+              </w:rPr>
+              <w:t>Chọn dịch vụ muốn khám</w:t>
+            </w:r>
+          </w:p>
+          <w:p>
+            <w:pPr>
+              <w:numPr>
+                <w:ilvl w:val="0"/>
+                <w:numId w:val="1"/>
+              </w:numPr>
+              <w:ind w:left="0" w:leftChars="0" w:firstLine="0" w:firstLineChars="0"/>
+              <w:rPr>
+                <w:rFonts w:hint="default"/>
+                <w:vertAlign w:val="baseline"/>
+                <w:lang w:val="en-US"/>
+              </w:rPr>
+            </w:pPr>
+            <w:r>
+              <w:rPr>
+                <w:rFonts w:hint="default"/>
+                <w:vertAlign w:val="baseline"/>
+                <w:lang w:val="en-US"/>
+              </w:rPr>
+              <w:t>Xem chi phí dự kiến</w:t>
+            </w:r>
+          </w:p>
+          <w:p>
+            <w:pPr>
+              <w:rPr>
+                <w:rFonts w:hint="default"/>
+                <w:vertAlign w:val="baseline"/>
+                <w:lang w:val="en-US"/>
+              </w:rPr>
+            </w:pPr>
+          </w:p>
+        </w:tc>
+      </w:tr>
+      <w:tr>
+        <w:tc>
+          <w:tcPr>
+            <w:tcW w:w="2452" w:type="dxa"/>
+          </w:tcPr>
+          <w:p>
+            <w:pPr>
+              <w:jc w:val="center"/>
+              <w:rPr>
+                <w:rFonts w:hint="default"/>
+                <w:vertAlign w:val="baseline"/>
+                <w:lang w:val="en-US"/>
+              </w:rPr>
+            </w:pPr>
+            <w:r>
+              <w:rPr>
+                <w:rFonts w:hint="default"/>
+                <w:vertAlign w:val="baseline"/>
+                <w:lang w:val="en-US"/>
+              </w:rPr>
+              <w:t>Yêu cầu phi chức năng</w:t>
+            </w:r>
+          </w:p>
+        </w:tc>
+        <w:tc>
+          <w:tcPr>
+            <w:tcW w:w="7185" w:type="dxa"/>
+          </w:tcPr>
+          <w:p>
+            <w:pPr>
+              <w:rPr>
+                <w:rFonts w:hint="default"/>
+                <w:vertAlign w:val="baseline"/>
+                <w:lang w:val="en-US"/>
+              </w:rPr>
+            </w:pPr>
+            <w:r>
+              <w:rPr>
+                <w:rFonts w:hint="default"/>
+                <w:vertAlign w:val="baseline"/>
+                <w:lang w:val="en-US"/>
+              </w:rPr>
+              <w:t>- Yêu cầu hệ thống bảo mật thông tin người dùng</w:t>
+            </w:r>
+          </w:p>
+          <w:p>
+            <w:pPr>
+              <w:rPr>
+                <w:rFonts w:hint="default"/>
+                <w:vertAlign w:val="baseline"/>
+                <w:lang w:val="en-US"/>
+              </w:rPr>
+            </w:pPr>
+            <w:r>
+              <w:rPr>
+                <w:rFonts w:hint="default"/>
+                <w:vertAlign w:val="baseline"/>
+                <w:lang w:val="en-US"/>
+              </w:rPr>
+              <w:t>- Yêu cầu hệ thống có thể xử lí 1000 đơn mà không bị quá tải</w:t>
+            </w:r>
+          </w:p>
+        </w:tc>
+      </w:tr>
+      <w:tr>
+        <w:tc>
+          <w:tcPr>
+            <w:tcW w:w="2452" w:type="dxa"/>
+          </w:tcPr>
+          <w:p>
+            <w:pPr>
+              <w:jc w:val="center"/>
+              <w:rPr>
+                <w:rFonts w:hint="default"/>
+                <w:vertAlign w:val="baseline"/>
+                <w:lang w:val="en-US"/>
+              </w:rPr>
+            </w:pPr>
+            <w:r>
+              <w:rPr>
+                <w:rFonts w:hint="default"/>
+                <w:vertAlign w:val="baseline"/>
+                <w:lang w:val="en-US"/>
+              </w:rPr>
+              <w:t>BR1 -&gt; Bước 1</w:t>
+            </w:r>
+          </w:p>
+        </w:tc>
+        <w:tc>
+          <w:tcPr>
+            <w:tcW w:w="7185" w:type="dxa"/>
+          </w:tcPr>
+          <w:p>
+            <w:pPr>
+              <w:rPr>
+                <w:rFonts w:hint="default"/>
+                <w:vertAlign w:val="baseline"/>
+                <w:lang w:val="en-US"/>
+              </w:rPr>
+            </w:pPr>
+            <w:r>
+              <w:rPr>
+                <w:rFonts w:hint="default"/>
+                <w:vertAlign w:val="baseline"/>
+                <w:lang w:val="en-US"/>
+              </w:rPr>
+              <w:t>BR1: Chỉ đặt lịch khám trong vòng 14 ngày -&gt; Bước 1: Chọn chuyên khoa và ngày khám -&gt; Nếu lịch khám được đặt vượt quá 14 ngày thì thông báo lỗi và huỷ yêu cầu</w:t>
+            </w:r>
+          </w:p>
+        </w:tc>
+      </w:tr>
+      <w:tr>
+        <w:tc>
+          <w:tcPr>
+            <w:tcW w:w="2452" w:type="dxa"/>
+          </w:tcPr>
+          <w:p>
+            <w:pPr>
+              <w:jc w:val="center"/>
+              <w:rPr>
+                <w:rFonts w:hint="default"/>
+                <w:vertAlign w:val="baseline"/>
+                <w:lang w:val="en-US"/>
+              </w:rPr>
+            </w:pPr>
+            <w:r>
+              <w:rPr>
+                <w:rFonts w:hint="default"/>
+                <w:vertAlign w:val="baseline"/>
+                <w:lang w:val="en-US"/>
+              </w:rPr>
+              <w:t>BR 3-&gt; Bước 6</w:t>
+            </w:r>
+          </w:p>
+        </w:tc>
+        <w:tc>
+          <w:tcPr>
+            <w:tcW w:w="7185" w:type="dxa"/>
+          </w:tcPr>
+          <w:p>
+            <w:pPr>
+              <w:rPr>
+                <w:rFonts w:hint="default"/>
+                <w:vertAlign w:val="baseline"/>
+                <w:lang w:val="en-US"/>
+              </w:rPr>
+            </w:pPr>
+            <w:r>
+              <w:rPr>
+                <w:rFonts w:hint="default"/>
+                <w:vertAlign w:val="baseline"/>
+                <w:lang w:val="en-US"/>
+              </w:rPr>
+              <w:t>BR3: Mỗi lịch hẹn thuộc 1 bệnh nhân và 1 khung giờ, bệnh nhân có thể có nhiều lịch hẹn nhưng không được đặt 2 lịch hẹn cùng khung giờ -&gt; Bước 6: Hệ thống kiểm tra khung giờ còn chổ -&gt; A2 ( Bước 6 ): Nếu khung giờ hết chổ -&gt; Thông báo quay lại bước 3</w:t>
+            </w:r>
+          </w:p>
+        </w:tc>
+      </w:tr>
+      <w:tr>
+        <w:tc>
+          <w:tcPr>
+            <w:tcW w:w="2452" w:type="dxa"/>
+          </w:tcPr>
+          <w:p>
+            <w:pPr>
+              <w:jc w:val="center"/>
+              <w:rPr>
+                <w:rFonts w:hint="default"/>
+                <w:vertAlign w:val="baseline"/>
+                <w:lang w:val="en-US"/>
+              </w:rPr>
+            </w:pPr>
+            <w:r>
+              <w:rPr>
+                <w:rFonts w:hint="default"/>
+                <w:vertAlign w:val="baseline"/>
+                <w:lang w:val="en-US"/>
+              </w:rPr>
+              <w:t>Điểm chưa rõ - Câu hỏi</w:t>
+            </w:r>
+          </w:p>
+        </w:tc>
+        <w:tc>
+          <w:tcPr>
+            <w:tcW w:w="7185" w:type="dxa"/>
+          </w:tcPr>
+          <w:p>
+            <w:pPr>
+              <w:rPr>
+                <w:rFonts w:hint="default"/>
+                <w:vertAlign w:val="baseline"/>
+                <w:lang w:val="en-US"/>
+              </w:rPr>
+            </w:pPr>
+          </w:p>
+        </w:tc>
+      </w:tr>
+    </w:tbl>
+    <w:p>
+      <w:pPr>
+        <w:rPr>
+          <w:rFonts w:hint="default"/>
+          <w:lang w:val="en-US"/>
+        </w:rPr>
+      </w:pPr>
+    </w:p>
+    <w:p>
+      <w:pPr>
+        <w:rPr>
+          <w:rFonts w:hint="default"/>
+          <w:lang w:val="en-US"/>
+        </w:rPr>
+      </w:pPr>
       <w:bookmarkStart w:id="0" w:name="_GoBack"/>
       <w:bookmarkEnd w:id="0"/>
     </w:p>
@@ -14,6 +566,26 @@
     </w:sectPr>
   </w:body>
 </w:document>
+</file>
+
+<file path=word/numbering.xml><?xml version="1.0" encoding="utf-8"?>
+<w:numbering xmlns:wpc="http://schemas.microsoft.com/office/word/2010/wordprocessingCanvas" xmlns:mc="http://schemas.openxmlformats.org/markup-compatibility/2006" xmlns:o="urn:schemas-microsoft-com:office:office" xmlns:r="http://schemas.openxmlformats.org/officeDocument/2006/relationships" xmlns:m="http://schemas.openxmlformats.org/officeDocument/2006/math" xmlns:v="urn:schemas-microsoft-com:vml" xmlns:wp14="http://schemas.microsoft.com/office/word/2010/wordprocessingDrawing" xmlns:wp="http://schemas.openxmlformats.org/drawingml/2006/wordprocessingDrawing" xmlns:w10="urn:schemas-microsoft-com:office:word" xmlns:w="http://schemas.openxmlformats.org/wordprocessingml/2006/main" xmlns:w14="http://schemas.microsoft.com/office/word/2010/wordml" xmlns:wpg="http://schemas.microsoft.com/office/word/2010/wordprocessingGroup" xmlns:wpi="http://schemas.microsoft.com/office/word/2010/wordprocessingInk" xmlns:wne="http://schemas.microsoft.com/office/word/2006/wordml" xmlns:wps="http://schemas.microsoft.com/office/word/2010/wordprocessingShape" xmlns:wpsCustomData="http://www.wps.cn/officeDocument/2013/wpsCustomData" mc:Ignorable="w14 wp14">
+  <w:abstractNum w:abstractNumId="0">
+    <w:nsid w:val="6BEEDC6B"/>
+    <w:multiLevelType w:val="singleLevel"/>
+    <w:tmpl w:val="6BEEDC6B"/>
+    <w:lvl w:ilvl="0" w:tentative="0">
+      <w:start w:val="1"/>
+      <w:numFmt w:val="decimal"/>
+      <w:suff w:val="space"/>
+      <w:lvlText w:val="%1."/>
+      <w:lvlJc w:val="left"/>
+    </w:lvl>
+  </w:abstractNum>
+  <w:num w:numId="1">
+    <w:abstractNumId w:val="0"/>
+  </w:num>
+</w:numbering>
 </file>
 
 <file path=word/styles.xml><?xml version="1.0" encoding="utf-8"?>
@@ -303,6 +875,25 @@
       </w:tblCellMar>
     </w:tblPr>
   </w:style>
+  <w:style w:type="table" w:styleId="4">
+    <w:name w:val="Table Grid"/>
+    <w:basedOn w:val="3"/>
+    <w:uiPriority w:val="0"/>
+    <w:pPr>
+      <w:widowControl w:val="0"/>
+      <w:jc w:val="both"/>
+    </w:pPr>
+    <w:tblPr>
+      <w:tblBorders>
+        <w:top w:val="single" w:color="auto" w:sz="4" w:space="0"/>
+        <w:left w:val="single" w:color="auto" w:sz="4" w:space="0"/>
+        <w:bottom w:val="single" w:color="auto" w:sz="4" w:space="0"/>
+        <w:right w:val="single" w:color="auto" w:sz="4" w:space="0"/>
+        <w:insideH w:val="single" w:color="auto" w:sz="4" w:space="0"/>
+        <w:insideV w:val="single" w:color="auto" w:sz="4" w:space="0"/>
+      </w:tblBorders>
+    </w:tblPr>
+  </w:style>
 </w:styles>
 </file>
 

</xml_diff>